<commit_message>
Update ESP32 pinout documentation and enhance charger functionality
- Added detailed pinout information for the ESP32, including GPIO assignments and power connections.
- Modified voltage display formatting in the garage charger to show two decimal places for improved accuracy.
- Introduced a new minimum battery voltage configuration option in the YAML file for better battery management.
- Added a template sensor for raw battery voltage and adjusted the logic for calculating battery percentage.
- Implemented a button to dump raw INA226 readings for diagnostic purposes.
- Updated relay configuration to reflect the correct active state based on hardware testing.
</commit_message>
<xml_diff>
--- a/docs/ESP32 Pinout.docx
+++ b/docs/ESP32 Pinout.docx
@@ -759,6 +759,1016 @@
         </w:drawing>
       </w:r>
     </w:p>
+    <w:tbl>
+      <w:tblPr>
+        <w:tblStyle w:val="TableGrid"/>
+        <w:tblpPr w:leftFromText="180" w:rightFromText="180" w:vertAnchor="text" w:horzAnchor="margin" w:tblpY="-429"/>
+        <w:tblW w:w="3571" w:type="dxa"/>
+        <w:tblLook w:val="04A0" w:firstRow="1" w:lastRow="0" w:firstColumn="1" w:lastColumn="0" w:noHBand="0" w:noVBand="1"/>
+      </w:tblPr>
+      <w:tblGrid>
+        <w:gridCol w:w="1782"/>
+        <w:gridCol w:w="1789"/>
+      </w:tblGrid>
+      <w:tr>
+        <w:trPr>
+          <w:trHeight w:val="340"/>
+        </w:trPr>
+        <w:tc>
+          <w:tcPr>
+            <w:tcW w:w="3571" w:type="dxa"/>
+            <w:gridSpan w:val="2"/>
+          </w:tcPr>
+          <w:p>
+            <w:pPr>
+              <w:jc w:val="center"/>
+              <w:rPr>
+                <w:lang w:val="en-US"/>
+              </w:rPr>
+            </w:pPr>
+            <w:r>
+              <w:rPr>
+                <w:lang w:val="en-US"/>
+              </w:rPr>
+              <w:lastRenderedPageBreak/>
+              <w:t>USB</w:t>
+            </w:r>
+          </w:p>
+        </w:tc>
+      </w:tr>
+      <w:tr>
+        <w:trPr>
+          <w:trHeight w:val="340"/>
+        </w:trPr>
+        <w:tc>
+          <w:tcPr>
+            <w:tcW w:w="1782" w:type="dxa"/>
+          </w:tcPr>
+          <w:p>
+            <w:pPr>
+              <w:rPr>
+                <w:lang w:val="en-US"/>
+              </w:rPr>
+            </w:pPr>
+            <w:r>
+              <w:rPr>
+                <w:lang w:val="en-US"/>
+              </w:rPr>
+              <w:t>VIN 5V</w:t>
+            </w:r>
+          </w:p>
+        </w:tc>
+        <w:tc>
+          <w:tcPr>
+            <w:tcW w:w="1789" w:type="dxa"/>
+          </w:tcPr>
+          <w:p>
+            <w:pPr>
+              <w:jc w:val="right"/>
+              <w:rPr>
+                <w:lang w:val="en-US"/>
+              </w:rPr>
+            </w:pPr>
+            <w:r>
+              <w:rPr>
+                <w:lang w:val="en-US"/>
+              </w:rPr>
+              <w:t>3V3</w:t>
+            </w:r>
+          </w:p>
+        </w:tc>
+      </w:tr>
+      <w:tr>
+        <w:trPr>
+          <w:trHeight w:val="329"/>
+        </w:trPr>
+        <w:tc>
+          <w:tcPr>
+            <w:tcW w:w="1782" w:type="dxa"/>
+          </w:tcPr>
+          <w:p>
+            <w:pPr>
+              <w:rPr>
+                <w:lang w:val="en-US"/>
+              </w:rPr>
+            </w:pPr>
+            <w:r>
+              <w:rPr>
+                <w:lang w:val="en-US"/>
+              </w:rPr>
+              <w:t>GND</w:t>
+            </w:r>
+          </w:p>
+        </w:tc>
+        <w:tc>
+          <w:tcPr>
+            <w:tcW w:w="1789" w:type="dxa"/>
+          </w:tcPr>
+          <w:p>
+            <w:pPr>
+              <w:jc w:val="right"/>
+              <w:rPr>
+                <w:lang w:val="en-US"/>
+              </w:rPr>
+            </w:pPr>
+            <w:r>
+              <w:rPr>
+                <w:lang w:val="en-US"/>
+              </w:rPr>
+              <w:t>GND</w:t>
+            </w:r>
+          </w:p>
+        </w:tc>
+      </w:tr>
+      <w:tr>
+        <w:trPr>
+          <w:trHeight w:val="340"/>
+        </w:trPr>
+        <w:tc>
+          <w:tcPr>
+            <w:tcW w:w="1782" w:type="dxa"/>
+          </w:tcPr>
+          <w:p>
+            <w:pPr>
+              <w:rPr>
+                <w:lang w:val="en-US"/>
+              </w:rPr>
+            </w:pPr>
+            <w:r>
+              <w:rPr>
+                <w:lang w:val="en-US"/>
+              </w:rPr>
+              <w:t>GPIO</w:t>
+            </w:r>
+            <w:r>
+              <w:rPr>
+                <w:lang w:val="en-US"/>
+              </w:rPr>
+              <w:t xml:space="preserve"> </w:t>
+            </w:r>
+            <w:r>
+              <w:rPr>
+                <w:lang w:val="en-US"/>
+              </w:rPr>
+              <w:t>13</w:t>
+            </w:r>
+          </w:p>
+        </w:tc>
+        <w:tc>
+          <w:tcPr>
+            <w:tcW w:w="1789" w:type="dxa"/>
+          </w:tcPr>
+          <w:p>
+            <w:pPr>
+              <w:jc w:val="right"/>
+              <w:rPr>
+                <w:lang w:val="en-US"/>
+              </w:rPr>
+            </w:pPr>
+            <w:r>
+              <w:rPr>
+                <w:lang w:val="en-US"/>
+              </w:rPr>
+              <w:t>GPIO</w:t>
+            </w:r>
+            <w:r>
+              <w:rPr>
+                <w:lang w:val="en-US"/>
+              </w:rPr>
+              <w:t>15</w:t>
+            </w:r>
+          </w:p>
+        </w:tc>
+      </w:tr>
+      <w:tr>
+        <w:trPr>
+          <w:trHeight w:val="340"/>
+        </w:trPr>
+        <w:tc>
+          <w:tcPr>
+            <w:tcW w:w="1782" w:type="dxa"/>
+          </w:tcPr>
+          <w:p>
+            <w:pPr>
+              <w:rPr>
+                <w:lang w:val="en-US"/>
+              </w:rPr>
+            </w:pPr>
+            <w:r>
+              <w:rPr>
+                <w:lang w:val="en-US"/>
+              </w:rPr>
+              <w:t>GPIO</w:t>
+            </w:r>
+            <w:r>
+              <w:rPr>
+                <w:lang w:val="en-US"/>
+              </w:rPr>
+              <w:t xml:space="preserve"> </w:t>
+            </w:r>
+            <w:r>
+              <w:rPr>
+                <w:lang w:val="en-US"/>
+              </w:rPr>
+              <w:t>12</w:t>
+            </w:r>
+          </w:p>
+        </w:tc>
+        <w:tc>
+          <w:tcPr>
+            <w:tcW w:w="1789" w:type="dxa"/>
+          </w:tcPr>
+          <w:p>
+            <w:pPr>
+              <w:jc w:val="right"/>
+              <w:rPr>
+                <w:lang w:val="en-US"/>
+              </w:rPr>
+            </w:pPr>
+            <w:r>
+              <w:rPr>
+                <w:lang w:val="en-US"/>
+              </w:rPr>
+              <w:t>GPIO</w:t>
+            </w:r>
+            <w:r>
+              <w:rPr>
+                <w:lang w:val="en-US"/>
+              </w:rPr>
+              <w:t xml:space="preserve"> 0</w:t>
+            </w:r>
+            <w:r>
+              <w:rPr>
+                <w:lang w:val="en-US"/>
+              </w:rPr>
+              <w:t>2</w:t>
+            </w:r>
+          </w:p>
+        </w:tc>
+      </w:tr>
+      <w:tr>
+        <w:trPr>
+          <w:trHeight w:val="340"/>
+        </w:trPr>
+        <w:tc>
+          <w:tcPr>
+            <w:tcW w:w="1782" w:type="dxa"/>
+          </w:tcPr>
+          <w:p>
+            <w:pPr>
+              <w:rPr>
+                <w:lang w:val="en-US"/>
+              </w:rPr>
+            </w:pPr>
+            <w:r>
+              <w:rPr>
+                <w:lang w:val="en-US"/>
+              </w:rPr>
+              <w:t>GPIO</w:t>
+            </w:r>
+            <w:r>
+              <w:rPr>
+                <w:lang w:val="en-US"/>
+              </w:rPr>
+              <w:t xml:space="preserve"> </w:t>
+            </w:r>
+            <w:r>
+              <w:rPr>
+                <w:lang w:val="en-US"/>
+              </w:rPr>
+              <w:t>14</w:t>
+            </w:r>
+          </w:p>
+        </w:tc>
+        <w:tc>
+          <w:tcPr>
+            <w:tcW w:w="1789" w:type="dxa"/>
+          </w:tcPr>
+          <w:p>
+            <w:pPr>
+              <w:jc w:val="right"/>
+              <w:rPr>
+                <w:lang w:val="en-US"/>
+              </w:rPr>
+            </w:pPr>
+            <w:r>
+              <w:rPr>
+                <w:lang w:val="en-US"/>
+              </w:rPr>
+              <w:t>GPIO</w:t>
+            </w:r>
+            <w:r>
+              <w:rPr>
+                <w:lang w:val="en-US"/>
+              </w:rPr>
+              <w:t xml:space="preserve"> 0</w:t>
+            </w:r>
+            <w:r>
+              <w:rPr>
+                <w:lang w:val="en-US"/>
+              </w:rPr>
+              <w:t>4</w:t>
+            </w:r>
+          </w:p>
+        </w:tc>
+      </w:tr>
+      <w:tr>
+        <w:trPr>
+          <w:trHeight w:val="340"/>
+        </w:trPr>
+        <w:tc>
+          <w:tcPr>
+            <w:tcW w:w="1782" w:type="dxa"/>
+          </w:tcPr>
+          <w:p>
+            <w:pPr>
+              <w:rPr>
+                <w:lang w:val="en-US"/>
+              </w:rPr>
+            </w:pPr>
+            <w:r>
+              <w:rPr>
+                <w:lang w:val="en-US"/>
+              </w:rPr>
+              <w:t>GPIO</w:t>
+            </w:r>
+            <w:r>
+              <w:rPr>
+                <w:lang w:val="en-US"/>
+              </w:rPr>
+              <w:t xml:space="preserve"> </w:t>
+            </w:r>
+            <w:r>
+              <w:rPr>
+                <w:lang w:val="en-US"/>
+              </w:rPr>
+              <w:t>27</w:t>
+            </w:r>
+          </w:p>
+        </w:tc>
+        <w:tc>
+          <w:tcPr>
+            <w:tcW w:w="1789" w:type="dxa"/>
+          </w:tcPr>
+          <w:p>
+            <w:pPr>
+              <w:jc w:val="right"/>
+              <w:rPr>
+                <w:lang w:val="en-US"/>
+              </w:rPr>
+            </w:pPr>
+            <w:r>
+              <w:rPr>
+                <w:lang w:val="en-US"/>
+              </w:rPr>
+              <w:t xml:space="preserve">RX2 </w:t>
+            </w:r>
+            <w:r>
+              <w:rPr>
+                <w:lang w:val="en-US"/>
+              </w:rPr>
+              <w:t>GPIO</w:t>
+            </w:r>
+            <w:r>
+              <w:rPr>
+                <w:lang w:val="en-US"/>
+              </w:rPr>
+              <w:t>16</w:t>
+            </w:r>
+          </w:p>
+        </w:tc>
+      </w:tr>
+      <w:tr>
+        <w:trPr>
+          <w:trHeight w:val="340"/>
+        </w:trPr>
+        <w:tc>
+          <w:tcPr>
+            <w:tcW w:w="1782" w:type="dxa"/>
+          </w:tcPr>
+          <w:p>
+            <w:pPr>
+              <w:rPr>
+                <w:lang w:val="en-US"/>
+              </w:rPr>
+            </w:pPr>
+            <w:r>
+              <w:rPr>
+                <w:lang w:val="en-US"/>
+              </w:rPr>
+              <w:t>GPIO</w:t>
+            </w:r>
+            <w:r>
+              <w:rPr>
+                <w:lang w:val="en-US"/>
+              </w:rPr>
+              <w:t xml:space="preserve"> </w:t>
+            </w:r>
+            <w:r>
+              <w:rPr>
+                <w:lang w:val="en-US"/>
+              </w:rPr>
+              <w:t>26</w:t>
+            </w:r>
+          </w:p>
+        </w:tc>
+        <w:tc>
+          <w:tcPr>
+            <w:tcW w:w="1789" w:type="dxa"/>
+          </w:tcPr>
+          <w:p>
+            <w:pPr>
+              <w:jc w:val="right"/>
+              <w:rPr>
+                <w:lang w:val="en-US"/>
+              </w:rPr>
+            </w:pPr>
+            <w:r>
+              <w:rPr>
+                <w:lang w:val="en-US"/>
+              </w:rPr>
+              <w:t xml:space="preserve">TX2 </w:t>
+            </w:r>
+            <w:r>
+              <w:rPr>
+                <w:lang w:val="en-US"/>
+              </w:rPr>
+              <w:t>GPIO</w:t>
+            </w:r>
+            <w:r>
+              <w:rPr>
+                <w:lang w:val="en-US"/>
+              </w:rPr>
+              <w:t>17</w:t>
+            </w:r>
+          </w:p>
+        </w:tc>
+      </w:tr>
+      <w:tr>
+        <w:trPr>
+          <w:trHeight w:val="340"/>
+        </w:trPr>
+        <w:tc>
+          <w:tcPr>
+            <w:tcW w:w="1782" w:type="dxa"/>
+          </w:tcPr>
+          <w:p>
+            <w:pPr>
+              <w:rPr>
+                <w:lang w:val="en-US"/>
+              </w:rPr>
+            </w:pPr>
+            <w:r>
+              <w:rPr>
+                <w:lang w:val="en-US"/>
+              </w:rPr>
+              <w:t>GPIO</w:t>
+            </w:r>
+            <w:r>
+              <w:rPr>
+                <w:lang w:val="en-US"/>
+              </w:rPr>
+              <w:t xml:space="preserve"> </w:t>
+            </w:r>
+            <w:r>
+              <w:rPr>
+                <w:lang w:val="en-US"/>
+              </w:rPr>
+              <w:t>25</w:t>
+            </w:r>
+          </w:p>
+        </w:tc>
+        <w:tc>
+          <w:tcPr>
+            <w:tcW w:w="1789" w:type="dxa"/>
+          </w:tcPr>
+          <w:p>
+            <w:pPr>
+              <w:jc w:val="right"/>
+              <w:rPr>
+                <w:lang w:val="en-US"/>
+              </w:rPr>
+            </w:pPr>
+            <w:r>
+              <w:rPr>
+                <w:lang w:val="en-US"/>
+              </w:rPr>
+              <w:t xml:space="preserve">CS </w:t>
+            </w:r>
+            <w:r>
+              <w:rPr>
+                <w:lang w:val="en-US"/>
+              </w:rPr>
+              <w:t>GPIO</w:t>
+            </w:r>
+            <w:r>
+              <w:rPr>
+                <w:lang w:val="en-US"/>
+              </w:rPr>
+              <w:t xml:space="preserve"> 05</w:t>
+            </w:r>
+          </w:p>
+        </w:tc>
+      </w:tr>
+      <w:tr>
+        <w:trPr>
+          <w:trHeight w:val="340"/>
+        </w:trPr>
+        <w:tc>
+          <w:tcPr>
+            <w:tcW w:w="1782" w:type="dxa"/>
+          </w:tcPr>
+          <w:p>
+            <w:pPr>
+              <w:rPr>
+                <w:lang w:val="en-US"/>
+              </w:rPr>
+            </w:pPr>
+            <w:r>
+              <w:rPr>
+                <w:lang w:val="en-US"/>
+              </w:rPr>
+              <w:t>GPIO</w:t>
+            </w:r>
+            <w:r>
+              <w:rPr>
+                <w:lang w:val="en-US"/>
+              </w:rPr>
+              <w:t xml:space="preserve"> </w:t>
+            </w:r>
+            <w:r>
+              <w:rPr>
+                <w:lang w:val="en-US"/>
+              </w:rPr>
+              <w:t>33</w:t>
+            </w:r>
+          </w:p>
+        </w:tc>
+        <w:tc>
+          <w:tcPr>
+            <w:tcW w:w="1789" w:type="dxa"/>
+          </w:tcPr>
+          <w:p>
+            <w:pPr>
+              <w:jc w:val="right"/>
+              <w:rPr>
+                <w:lang w:val="en-US"/>
+              </w:rPr>
+            </w:pPr>
+            <w:r>
+              <w:rPr>
+                <w:lang w:val="en-US"/>
+              </w:rPr>
+              <w:t>SCK GPIO 18</w:t>
+            </w:r>
+          </w:p>
+        </w:tc>
+      </w:tr>
+      <w:tr>
+        <w:trPr>
+          <w:trHeight w:val="340"/>
+        </w:trPr>
+        <w:tc>
+          <w:tcPr>
+            <w:tcW w:w="1782" w:type="dxa"/>
+          </w:tcPr>
+          <w:p>
+            <w:pPr>
+              <w:rPr>
+                <w:lang w:val="en-US"/>
+              </w:rPr>
+            </w:pPr>
+            <w:r>
+              <w:rPr>
+                <w:lang w:val="en-US"/>
+              </w:rPr>
+              <w:t>GPIO</w:t>
+            </w:r>
+            <w:r>
+              <w:rPr>
+                <w:lang w:val="en-US"/>
+              </w:rPr>
+              <w:t xml:space="preserve"> </w:t>
+            </w:r>
+            <w:r>
+              <w:rPr>
+                <w:lang w:val="en-US"/>
+              </w:rPr>
+              <w:t>32</w:t>
+            </w:r>
+          </w:p>
+        </w:tc>
+        <w:tc>
+          <w:tcPr>
+            <w:tcW w:w="1789" w:type="dxa"/>
+          </w:tcPr>
+          <w:p>
+            <w:pPr>
+              <w:jc w:val="right"/>
+              <w:rPr>
+                <w:lang w:val="en-US"/>
+              </w:rPr>
+            </w:pPr>
+            <w:r>
+              <w:rPr>
+                <w:lang w:val="en-US"/>
+              </w:rPr>
+              <w:t xml:space="preserve">MOSI </w:t>
+            </w:r>
+            <w:r>
+              <w:rPr>
+                <w:lang w:val="en-US"/>
+              </w:rPr>
+              <w:t>GPIO</w:t>
+            </w:r>
+            <w:r>
+              <w:rPr>
+                <w:lang w:val="en-US"/>
+              </w:rPr>
+              <w:t xml:space="preserve"> 19</w:t>
+            </w:r>
+          </w:p>
+        </w:tc>
+      </w:tr>
+      <w:tr>
+        <w:trPr>
+          <w:trHeight w:val="340"/>
+        </w:trPr>
+        <w:tc>
+          <w:tcPr>
+            <w:tcW w:w="1782" w:type="dxa"/>
+          </w:tcPr>
+          <w:p>
+            <w:pPr>
+              <w:rPr>
+                <w:lang w:val="en-US"/>
+              </w:rPr>
+            </w:pPr>
+            <w:r>
+              <w:rPr>
+                <w:lang w:val="en-US"/>
+              </w:rPr>
+              <w:t>GPIO</w:t>
+            </w:r>
+            <w:r>
+              <w:rPr>
+                <w:lang w:val="en-US"/>
+              </w:rPr>
+              <w:t xml:space="preserve"> </w:t>
+            </w:r>
+            <w:r>
+              <w:rPr>
+                <w:lang w:val="en-US"/>
+              </w:rPr>
+              <w:t>35</w:t>
+            </w:r>
+          </w:p>
+        </w:tc>
+        <w:tc>
+          <w:tcPr>
+            <w:tcW w:w="1789" w:type="dxa"/>
+          </w:tcPr>
+          <w:p>
+            <w:pPr>
+              <w:jc w:val="right"/>
+              <w:rPr>
+                <w:lang w:val="en-US"/>
+              </w:rPr>
+            </w:pPr>
+            <w:r>
+              <w:rPr>
+                <w:lang w:val="en-US"/>
+              </w:rPr>
+              <w:t xml:space="preserve">SDA </w:t>
+            </w:r>
+            <w:r>
+              <w:rPr>
+                <w:lang w:val="en-US"/>
+              </w:rPr>
+              <w:t>GPIO</w:t>
+            </w:r>
+            <w:r>
+              <w:rPr>
+                <w:lang w:val="en-US"/>
+              </w:rPr>
+              <w:t xml:space="preserve"> 21</w:t>
+            </w:r>
+          </w:p>
+        </w:tc>
+      </w:tr>
+      <w:tr>
+        <w:trPr>
+          <w:trHeight w:val="340"/>
+        </w:trPr>
+        <w:tc>
+          <w:tcPr>
+            <w:tcW w:w="1782" w:type="dxa"/>
+          </w:tcPr>
+          <w:p>
+            <w:pPr>
+              <w:rPr>
+                <w:lang w:val="en-US"/>
+              </w:rPr>
+            </w:pPr>
+            <w:r>
+              <w:rPr>
+                <w:lang w:val="en-US"/>
+              </w:rPr>
+              <w:t>GPIO</w:t>
+            </w:r>
+            <w:r>
+              <w:rPr>
+                <w:lang w:val="en-US"/>
+              </w:rPr>
+              <w:t xml:space="preserve"> </w:t>
+            </w:r>
+            <w:r>
+              <w:rPr>
+                <w:lang w:val="en-US"/>
+              </w:rPr>
+              <w:t>34</w:t>
+            </w:r>
+          </w:p>
+        </w:tc>
+        <w:tc>
+          <w:tcPr>
+            <w:tcW w:w="1789" w:type="dxa"/>
+          </w:tcPr>
+          <w:p>
+            <w:pPr>
+              <w:jc w:val="right"/>
+              <w:rPr>
+                <w:lang w:val="en-US"/>
+              </w:rPr>
+            </w:pPr>
+            <w:r>
+              <w:rPr>
+                <w:lang w:val="en-US"/>
+              </w:rPr>
+              <w:t xml:space="preserve">RX0 </w:t>
+            </w:r>
+            <w:r>
+              <w:rPr>
+                <w:lang w:val="en-US"/>
+              </w:rPr>
+              <w:t>GPIO</w:t>
+            </w:r>
+            <w:r>
+              <w:rPr>
+                <w:lang w:val="en-US"/>
+              </w:rPr>
+              <w:t xml:space="preserve"> 03</w:t>
+            </w:r>
+          </w:p>
+        </w:tc>
+      </w:tr>
+      <w:tr>
+        <w:trPr>
+          <w:trHeight w:val="340"/>
+        </w:trPr>
+        <w:tc>
+          <w:tcPr>
+            <w:tcW w:w="1782" w:type="dxa"/>
+          </w:tcPr>
+          <w:p>
+            <w:pPr>
+              <w:rPr>
+                <w:lang w:val="en-US"/>
+              </w:rPr>
+            </w:pPr>
+            <w:r>
+              <w:rPr>
+                <w:lang w:val="en-US"/>
+              </w:rPr>
+              <w:t>GPIO</w:t>
+            </w:r>
+            <w:r>
+              <w:rPr>
+                <w:lang w:val="en-US"/>
+              </w:rPr>
+              <w:t xml:space="preserve"> </w:t>
+            </w:r>
+            <w:r>
+              <w:rPr>
+                <w:lang w:val="en-US"/>
+              </w:rPr>
+              <w:t>39</w:t>
+            </w:r>
+          </w:p>
+        </w:tc>
+        <w:tc>
+          <w:tcPr>
+            <w:tcW w:w="1789" w:type="dxa"/>
+          </w:tcPr>
+          <w:p>
+            <w:pPr>
+              <w:jc w:val="right"/>
+              <w:rPr>
+                <w:lang w:val="en-US"/>
+              </w:rPr>
+            </w:pPr>
+            <w:r>
+              <w:rPr>
+                <w:lang w:val="en-US"/>
+              </w:rPr>
+              <w:t xml:space="preserve">TX0 </w:t>
+            </w:r>
+            <w:r>
+              <w:rPr>
+                <w:lang w:val="en-US"/>
+              </w:rPr>
+              <w:t>GPIO</w:t>
+            </w:r>
+            <w:r>
+              <w:rPr>
+                <w:lang w:val="en-US"/>
+              </w:rPr>
+              <w:t xml:space="preserve"> 01</w:t>
+            </w:r>
+          </w:p>
+        </w:tc>
+      </w:tr>
+      <w:tr>
+        <w:trPr>
+          <w:trHeight w:val="340"/>
+        </w:trPr>
+        <w:tc>
+          <w:tcPr>
+            <w:tcW w:w="1782" w:type="dxa"/>
+          </w:tcPr>
+          <w:p>
+            <w:pPr>
+              <w:rPr>
+                <w:lang w:val="en-US"/>
+              </w:rPr>
+            </w:pPr>
+            <w:r>
+              <w:rPr>
+                <w:lang w:val="en-US"/>
+              </w:rPr>
+              <w:t>GPIO</w:t>
+            </w:r>
+            <w:r>
+              <w:rPr>
+                <w:lang w:val="en-US"/>
+              </w:rPr>
+              <w:t xml:space="preserve"> </w:t>
+            </w:r>
+            <w:r>
+              <w:rPr>
+                <w:lang w:val="en-US"/>
+              </w:rPr>
+              <w:t>36</w:t>
+            </w:r>
+          </w:p>
+        </w:tc>
+        <w:tc>
+          <w:tcPr>
+            <w:tcW w:w="1789" w:type="dxa"/>
+          </w:tcPr>
+          <w:p>
+            <w:pPr>
+              <w:jc w:val="right"/>
+              <w:rPr>
+                <w:lang w:val="en-US"/>
+              </w:rPr>
+            </w:pPr>
+            <w:r>
+              <w:rPr>
+                <w:lang w:val="en-US"/>
+              </w:rPr>
+              <w:t xml:space="preserve">SCL </w:t>
+            </w:r>
+            <w:r>
+              <w:rPr>
+                <w:lang w:val="en-US"/>
+              </w:rPr>
+              <w:t>GPIO</w:t>
+            </w:r>
+            <w:r>
+              <w:rPr>
+                <w:lang w:val="en-US"/>
+              </w:rPr>
+              <w:t xml:space="preserve"> 22</w:t>
+            </w:r>
+          </w:p>
+        </w:tc>
+      </w:tr>
+      <w:tr>
+        <w:trPr>
+          <w:trHeight w:val="340"/>
+        </w:trPr>
+        <w:tc>
+          <w:tcPr>
+            <w:tcW w:w="1782" w:type="dxa"/>
+          </w:tcPr>
+          <w:p>
+            <w:pPr>
+              <w:rPr>
+                <w:lang w:val="en-US"/>
+              </w:rPr>
+            </w:pPr>
+            <w:r>
+              <w:rPr>
+                <w:lang w:val="en-US"/>
+              </w:rPr>
+              <w:t>EN</w:t>
+            </w:r>
+          </w:p>
+        </w:tc>
+        <w:tc>
+          <w:tcPr>
+            <w:tcW w:w="1789" w:type="dxa"/>
+          </w:tcPr>
+          <w:p>
+            <w:pPr>
+              <w:jc w:val="right"/>
+              <w:rPr>
+                <w:lang w:val="en-US"/>
+              </w:rPr>
+            </w:pPr>
+            <w:r>
+              <w:rPr>
+                <w:lang w:val="en-US"/>
+              </w:rPr>
+              <w:t xml:space="preserve">COPI </w:t>
+            </w:r>
+            <w:r>
+              <w:rPr>
+                <w:lang w:val="en-US"/>
+              </w:rPr>
+              <w:t>GPIO</w:t>
+            </w:r>
+            <w:r>
+              <w:rPr>
+                <w:lang w:val="en-US"/>
+              </w:rPr>
+              <w:t xml:space="preserve"> 23</w:t>
+            </w:r>
+          </w:p>
+        </w:tc>
+      </w:tr>
+    </w:tbl>
+    <w:p>
+      <w:pPr>
+        <w:rPr>
+          <w:lang w:val="en-US"/>
+        </w:rPr>
+      </w:pPr>
+      <w:r>
+        <w:rPr>
+          <w:noProof/>
+        </w:rPr>
+        <w:drawing>
+          <wp:inline distT="0" distB="0" distL="0" distR="0" wp14:anchorId="1E25EE38" wp14:editId="089E6E99">
+            <wp:extent cx="5943600" cy="4339590"/>
+            <wp:effectExtent l="0" t="0" r="0" b="3810"/>
+            <wp:docPr id="919358869" name="Picture 1" descr="ESP32 ESP-WROOM-32D 0.96&quot; OLED Display pinout diagram"/>
+            <wp:cNvGraphicFramePr>
+              <a:graphicFrameLocks xmlns:a="http://schemas.openxmlformats.org/drawingml/2006/main" noChangeAspect="1"/>
+            </wp:cNvGraphicFramePr>
+            <a:graphic xmlns:a="http://schemas.openxmlformats.org/drawingml/2006/main">
+              <a:graphicData uri="http://schemas.openxmlformats.org/drawingml/2006/picture">
+                <pic:pic xmlns:pic="http://schemas.openxmlformats.org/drawingml/2006/picture">
+                  <pic:nvPicPr>
+                    <pic:cNvPr id="0" name="Picture 1" descr="ESP32 ESP-WROOM-32D 0.96&quot; OLED Display pinout diagram"/>
+                    <pic:cNvPicPr>
+                      <a:picLocks noChangeAspect="1" noChangeArrowheads="1"/>
+                    </pic:cNvPicPr>
+                  </pic:nvPicPr>
+                  <pic:blipFill>
+                    <a:blip r:embed="rId5">
+                      <a:extLst>
+                        <a:ext uri="{28A0092B-C50C-407E-A947-70E740481C1C}">
+                          <a14:useLocalDpi xmlns:a14="http://schemas.microsoft.com/office/drawing/2010/main" val="0"/>
+                        </a:ext>
+                      </a:extLst>
+                    </a:blip>
+                    <a:srcRect/>
+                    <a:stretch>
+                      <a:fillRect/>
+                    </a:stretch>
+                  </pic:blipFill>
+                  <pic:spPr bwMode="auto">
+                    <a:xfrm>
+                      <a:off x="0" y="0"/>
+                      <a:ext cx="5943600" cy="4339590"/>
+                    </a:xfrm>
+                    <a:prstGeom prst="rect">
+                      <a:avLst/>
+                    </a:prstGeom>
+                    <a:noFill/>
+                    <a:ln>
+                      <a:noFill/>
+                    </a:ln>
+                  </pic:spPr>
+                </pic:pic>
+              </a:graphicData>
+            </a:graphic>
+          </wp:inline>
+        </w:drawing>
+      </w:r>
+    </w:p>
     <w:p>
       <w:pPr>
         <w:rPr>
@@ -776,7 +1786,7 @@
     <w:p>
       <w:pPr>
         <w:rPr>
-          <w:lang w:val="en-US"/>
+          <w:lang w:val="ru-RU"/>
         </w:rPr>
       </w:pPr>
     </w:p>
@@ -793,18 +1803,11 @@
           <w:lang w:val="ru-RU"/>
         </w:rPr>
       </w:pPr>
-    </w:p>
-    <w:p>
-      <w:pPr>
-        <w:rPr>
+      <w:r>
+        <w:rPr>
+          <w:noProof/>
           <w:lang w:val="ru-RU"/>
         </w:rPr>
-      </w:pPr>
-      <w:r>
-        <w:rPr>
-          <w:lang w:val="ru-RU"/>
-        </w:rPr>
-        <w:lastRenderedPageBreak/>
         <w:drawing>
           <wp:inline distT="0" distB="0" distL="0" distR="0" wp14:anchorId="573EA5F1" wp14:editId="1970FE32">
             <wp:extent cx="809625" cy="1438275"/>
@@ -821,10 +1824,10 @@
                     <pic:cNvPicPr/>
                   </pic:nvPicPr>
                   <pic:blipFill>
-                    <a:blip r:embed="rId5">
+                    <a:blip r:embed="rId6">
                       <a:extLst>
                         <a:ext uri="{96DAC541-7B7A-43D3-8B79-37D633B846F1}">
-                          <asvg:svgBlip xmlns:asvg="http://schemas.microsoft.com/office/drawing/2016/SVG/main" r:embed="rId6"/>
+                          <asvg:svgBlip xmlns:asvg="http://schemas.microsoft.com/office/drawing/2016/SVG/main" r:embed="rId7"/>
                         </a:ext>
                       </a:extLst>
                     </a:blip>
@@ -849,6 +1852,7 @@
       </w:r>
       <w:r>
         <w:rPr>
+          <w:noProof/>
           <w:lang w:val="ru-RU"/>
         </w:rPr>
         <w:drawing>
@@ -867,10 +1871,10 @@
                     <pic:cNvPicPr/>
                   </pic:nvPicPr>
                   <pic:blipFill>
-                    <a:blip r:embed="rId5">
+                    <a:blip r:embed="rId6">
                       <a:extLst>
                         <a:ext uri="{96DAC541-7B7A-43D3-8B79-37D633B846F1}">
-                          <asvg:svgBlip xmlns:asvg="http://schemas.microsoft.com/office/drawing/2016/SVG/main" r:embed="rId6"/>
+                          <asvg:svgBlip xmlns:asvg="http://schemas.microsoft.com/office/drawing/2016/SVG/main" r:embed="rId7"/>
                         </a:ext>
                       </a:extLst>
                     </a:blip>
@@ -895,6 +1899,7 @@
       </w:r>
       <w:r>
         <w:rPr>
+          <w:noProof/>
           <w:lang w:val="ru-RU"/>
         </w:rPr>
         <w:drawing>
@@ -913,10 +1918,10 @@
                     <pic:cNvPicPr/>
                   </pic:nvPicPr>
                   <pic:blipFill>
-                    <a:blip r:embed="rId5">
+                    <a:blip r:embed="rId6">
                       <a:extLst>
                         <a:ext uri="{96DAC541-7B7A-43D3-8B79-37D633B846F1}">
-                          <asvg:svgBlip xmlns:asvg="http://schemas.microsoft.com/office/drawing/2016/SVG/main" r:embed="rId6"/>
+                          <asvg:svgBlip xmlns:asvg="http://schemas.microsoft.com/office/drawing/2016/SVG/main" r:embed="rId7"/>
                         </a:ext>
                       </a:extLst>
                     </a:blip>
@@ -941,6 +1946,7 @@
       </w:r>
       <w:r>
         <w:rPr>
+          <w:noProof/>
           <w:lang w:val="ru-RU"/>
         </w:rPr>
         <w:drawing>
@@ -959,10 +1965,10 @@
                     <pic:cNvPicPr/>
                   </pic:nvPicPr>
                   <pic:blipFill>
-                    <a:blip r:embed="rId5">
+                    <a:blip r:embed="rId6">
                       <a:extLst>
                         <a:ext uri="{96DAC541-7B7A-43D3-8B79-37D633B846F1}">
-                          <asvg:svgBlip xmlns:asvg="http://schemas.microsoft.com/office/drawing/2016/SVG/main" r:embed="rId6"/>
+                          <asvg:svgBlip xmlns:asvg="http://schemas.microsoft.com/office/drawing/2016/SVG/main" r:embed="rId7"/>
                         </a:ext>
                       </a:extLst>
                     </a:blip>
@@ -987,6 +1993,7 @@
       </w:r>
       <w:r>
         <w:rPr>
+          <w:noProof/>
           <w:lang w:val="ru-RU"/>
         </w:rPr>
         <w:drawing>
@@ -1005,10 +2012,10 @@
                     <pic:cNvPicPr/>
                   </pic:nvPicPr>
                   <pic:blipFill>
-                    <a:blip r:embed="rId5">
+                    <a:blip r:embed="rId6">
                       <a:extLst>
                         <a:ext uri="{96DAC541-7B7A-43D3-8B79-37D633B846F1}">
-                          <asvg:svgBlip xmlns:asvg="http://schemas.microsoft.com/office/drawing/2016/SVG/main" r:embed="rId6"/>
+                          <asvg:svgBlip xmlns:asvg="http://schemas.microsoft.com/office/drawing/2016/SVG/main" r:embed="rId7"/>
                         </a:ext>
                       </a:extLst>
                     </a:blip>
@@ -1033,6 +2040,7 @@
       </w:r>
       <w:r>
         <w:rPr>
+          <w:noProof/>
           <w:lang w:val="ru-RU"/>
         </w:rPr>
         <w:drawing>
@@ -1051,10 +2059,10 @@
                     <pic:cNvPicPr/>
                   </pic:nvPicPr>
                   <pic:blipFill>
-                    <a:blip r:embed="rId5">
+                    <a:blip r:embed="rId6">
                       <a:extLst>
                         <a:ext uri="{96DAC541-7B7A-43D3-8B79-37D633B846F1}">
-                          <asvg:svgBlip xmlns:asvg="http://schemas.microsoft.com/office/drawing/2016/SVG/main" r:embed="rId6"/>
+                          <asvg:svgBlip xmlns:asvg="http://schemas.microsoft.com/office/drawing/2016/SVG/main" r:embed="rId7"/>
                         </a:ext>
                       </a:extLst>
                     </a:blip>
@@ -1079,6 +2087,7 @@
       </w:r>
       <w:r>
         <w:rPr>
+          <w:noProof/>
           <w:lang w:val="ru-RU"/>
         </w:rPr>
         <w:drawing>
@@ -1097,10 +2106,10 @@
                     <pic:cNvPicPr/>
                   </pic:nvPicPr>
                   <pic:blipFill>
-                    <a:blip r:embed="rId5">
+                    <a:blip r:embed="rId6">
                       <a:extLst>
                         <a:ext uri="{96DAC541-7B7A-43D3-8B79-37D633B846F1}">
-                          <asvg:svgBlip xmlns:asvg="http://schemas.microsoft.com/office/drawing/2016/SVG/main" r:embed="rId6"/>
+                          <asvg:svgBlip xmlns:asvg="http://schemas.microsoft.com/office/drawing/2016/SVG/main" r:embed="rId7"/>
                         </a:ext>
                       </a:extLst>
                     </a:blip>
@@ -1125,6 +2134,7 @@
       </w:r>
       <w:r>
         <w:rPr>
+          <w:noProof/>
           <w:lang w:val="ru-RU"/>
         </w:rPr>
         <w:drawing>
@@ -1143,10 +2153,10 @@
                     <pic:cNvPicPr/>
                   </pic:nvPicPr>
                   <pic:blipFill>
-                    <a:blip r:embed="rId5">
+                    <a:blip r:embed="rId6">
                       <a:extLst>
                         <a:ext uri="{96DAC541-7B7A-43D3-8B79-37D633B846F1}">
-                          <asvg:svgBlip xmlns:asvg="http://schemas.microsoft.com/office/drawing/2016/SVG/main" r:embed="rId6"/>
+                          <asvg:svgBlip xmlns:asvg="http://schemas.microsoft.com/office/drawing/2016/SVG/main" r:embed="rId7"/>
                         </a:ext>
                       </a:extLst>
                     </a:blip>
@@ -1171,6 +2181,7 @@
       </w:r>
       <w:r>
         <w:rPr>
+          <w:noProof/>
           <w:lang w:val="ru-RU"/>
         </w:rPr>
         <w:drawing>
@@ -1189,10 +2200,10 @@
                     <pic:cNvPicPr/>
                   </pic:nvPicPr>
                   <pic:blipFill>
-                    <a:blip r:embed="rId5">
+                    <a:blip r:embed="rId6">
                       <a:extLst>
                         <a:ext uri="{96DAC541-7B7A-43D3-8B79-37D633B846F1}">
-                          <asvg:svgBlip xmlns:asvg="http://schemas.microsoft.com/office/drawing/2016/SVG/main" r:embed="rId6"/>
+                          <asvg:svgBlip xmlns:asvg="http://schemas.microsoft.com/office/drawing/2016/SVG/main" r:embed="rId7"/>
                         </a:ext>
                       </a:extLst>
                     </a:blip>
@@ -1217,6 +2228,7 @@
       </w:r>
       <w:r>
         <w:rPr>
+          <w:noProof/>
           <w:lang w:val="ru-RU"/>
         </w:rPr>
         <w:drawing>
@@ -1235,10 +2247,10 @@
                     <pic:cNvPicPr/>
                   </pic:nvPicPr>
                   <pic:blipFill>
-                    <a:blip r:embed="rId5">
+                    <a:blip r:embed="rId6">
                       <a:extLst>
                         <a:ext uri="{96DAC541-7B7A-43D3-8B79-37D633B846F1}">
-                          <asvg:svgBlip xmlns:asvg="http://schemas.microsoft.com/office/drawing/2016/SVG/main" r:embed="rId6"/>
+                          <asvg:svgBlip xmlns:asvg="http://schemas.microsoft.com/office/drawing/2016/SVG/main" r:embed="rId7"/>
                         </a:ext>
                       </a:extLst>
                     </a:blip>
@@ -1263,6 +2275,7 @@
       </w:r>
       <w:r>
         <w:rPr>
+          <w:noProof/>
           <w:lang w:val="ru-RU"/>
         </w:rPr>
         <w:drawing>
@@ -1281,10 +2294,10 @@
                     <pic:cNvPicPr/>
                   </pic:nvPicPr>
                   <pic:blipFill>
-                    <a:blip r:embed="rId5">
+                    <a:blip r:embed="rId6">
                       <a:extLst>
                         <a:ext uri="{96DAC541-7B7A-43D3-8B79-37D633B846F1}">
-                          <asvg:svgBlip xmlns:asvg="http://schemas.microsoft.com/office/drawing/2016/SVG/main" r:embed="rId6"/>
+                          <asvg:svgBlip xmlns:asvg="http://schemas.microsoft.com/office/drawing/2016/SVG/main" r:embed="rId7"/>
                         </a:ext>
                       </a:extLst>
                     </a:blip>
@@ -1309,6 +2322,7 @@
       </w:r>
       <w:r>
         <w:rPr>
+          <w:noProof/>
           <w:lang w:val="ru-RU"/>
         </w:rPr>
         <w:drawing>
@@ -1327,10 +2341,10 @@
                     <pic:cNvPicPr/>
                   </pic:nvPicPr>
                   <pic:blipFill>
-                    <a:blip r:embed="rId5">
+                    <a:blip r:embed="rId6">
                       <a:extLst>
                         <a:ext uri="{96DAC541-7B7A-43D3-8B79-37D633B846F1}">
-                          <asvg:svgBlip xmlns:asvg="http://schemas.microsoft.com/office/drawing/2016/SVG/main" r:embed="rId6"/>
+                          <asvg:svgBlip xmlns:asvg="http://schemas.microsoft.com/office/drawing/2016/SVG/main" r:embed="rId7"/>
                         </a:ext>
                       </a:extLst>
                     </a:blip>
@@ -1355,6 +2369,7 @@
       </w:r>
       <w:r>
         <w:rPr>
+          <w:noProof/>
           <w:lang w:val="ru-RU"/>
         </w:rPr>
         <w:drawing>
@@ -1373,10 +2388,10 @@
                     <pic:cNvPicPr/>
                   </pic:nvPicPr>
                   <pic:blipFill>
-                    <a:blip r:embed="rId5">
+                    <a:blip r:embed="rId6">
                       <a:extLst>
                         <a:ext uri="{96DAC541-7B7A-43D3-8B79-37D633B846F1}">
-                          <asvg:svgBlip xmlns:asvg="http://schemas.microsoft.com/office/drawing/2016/SVG/main" r:embed="rId6"/>
+                          <asvg:svgBlip xmlns:asvg="http://schemas.microsoft.com/office/drawing/2016/SVG/main" r:embed="rId7"/>
                         </a:ext>
                       </a:extLst>
                     </a:blip>
@@ -1401,6 +2416,7 @@
       </w:r>
       <w:r>
         <w:rPr>
+          <w:noProof/>
           <w:lang w:val="ru-RU"/>
         </w:rPr>
         <w:drawing>
@@ -1419,10 +2435,10 @@
                     <pic:cNvPicPr/>
                   </pic:nvPicPr>
                   <pic:blipFill>
-                    <a:blip r:embed="rId5">
+                    <a:blip r:embed="rId6">
                       <a:extLst>
                         <a:ext uri="{96DAC541-7B7A-43D3-8B79-37D633B846F1}">
-                          <asvg:svgBlip xmlns:asvg="http://schemas.microsoft.com/office/drawing/2016/SVG/main" r:embed="rId6"/>
+                          <asvg:svgBlip xmlns:asvg="http://schemas.microsoft.com/office/drawing/2016/SVG/main" r:embed="rId7"/>
                         </a:ext>
                       </a:extLst>
                     </a:blip>
@@ -1447,6 +2463,7 @@
       </w:r>
       <w:r>
         <w:rPr>
+          <w:noProof/>
           <w:lang w:val="ru-RU"/>
         </w:rPr>
         <w:drawing>
@@ -1465,10 +2482,10 @@
                     <pic:cNvPicPr/>
                   </pic:nvPicPr>
                   <pic:blipFill>
-                    <a:blip r:embed="rId5">
+                    <a:blip r:embed="rId6">
                       <a:extLst>
                         <a:ext uri="{96DAC541-7B7A-43D3-8B79-37D633B846F1}">
-                          <asvg:svgBlip xmlns:asvg="http://schemas.microsoft.com/office/drawing/2016/SVG/main" r:embed="rId6"/>
+                          <asvg:svgBlip xmlns:asvg="http://schemas.microsoft.com/office/drawing/2016/SVG/main" r:embed="rId7"/>
                         </a:ext>
                       </a:extLst>
                     </a:blip>
@@ -1493,6 +2510,7 @@
       </w:r>
       <w:r>
         <w:rPr>
+          <w:noProof/>
           <w:lang w:val="ru-RU"/>
         </w:rPr>
         <w:drawing>
@@ -1511,10 +2529,10 @@
                     <pic:cNvPicPr/>
                   </pic:nvPicPr>
                   <pic:blipFill>
-                    <a:blip r:embed="rId5">
+                    <a:blip r:embed="rId6">
                       <a:extLst>
                         <a:ext uri="{96DAC541-7B7A-43D3-8B79-37D633B846F1}">
-                          <asvg:svgBlip xmlns:asvg="http://schemas.microsoft.com/office/drawing/2016/SVG/main" r:embed="rId6"/>
+                          <asvg:svgBlip xmlns:asvg="http://schemas.microsoft.com/office/drawing/2016/SVG/main" r:embed="rId7"/>
                         </a:ext>
                       </a:extLst>
                     </a:blip>
@@ -1539,6 +2557,7 @@
       </w:r>
       <w:r>
         <w:rPr>
+          <w:noProof/>
           <w:lang w:val="ru-RU"/>
         </w:rPr>
         <w:drawing>
@@ -1557,10 +2576,10 @@
                     <pic:cNvPicPr/>
                   </pic:nvPicPr>
                   <pic:blipFill>
-                    <a:blip r:embed="rId5">
+                    <a:blip r:embed="rId6">
                       <a:extLst>
                         <a:ext uri="{96DAC541-7B7A-43D3-8B79-37D633B846F1}">
-                          <asvg:svgBlip xmlns:asvg="http://schemas.microsoft.com/office/drawing/2016/SVG/main" r:embed="rId6"/>
+                          <asvg:svgBlip xmlns:asvg="http://schemas.microsoft.com/office/drawing/2016/SVG/main" r:embed="rId7"/>
                         </a:ext>
                       </a:extLst>
                     </a:blip>
@@ -1585,6 +2604,7 @@
       </w:r>
       <w:r>
         <w:rPr>
+          <w:noProof/>
           <w:lang w:val="ru-RU"/>
         </w:rPr>
         <w:drawing>
@@ -1603,10 +2623,10 @@
                     <pic:cNvPicPr/>
                   </pic:nvPicPr>
                   <pic:blipFill>
-                    <a:blip r:embed="rId5">
+                    <a:blip r:embed="rId6">
                       <a:extLst>
                         <a:ext uri="{96DAC541-7B7A-43D3-8B79-37D633B846F1}">
-                          <asvg:svgBlip xmlns:asvg="http://schemas.microsoft.com/office/drawing/2016/SVG/main" r:embed="rId6"/>
+                          <asvg:svgBlip xmlns:asvg="http://schemas.microsoft.com/office/drawing/2016/SVG/main" r:embed="rId7"/>
                         </a:ext>
                       </a:extLst>
                     </a:blip>
@@ -1631,6 +2651,7 @@
       </w:r>
       <w:r>
         <w:rPr>
+          <w:noProof/>
           <w:lang w:val="ru-RU"/>
         </w:rPr>
         <w:drawing>
@@ -1649,10 +2670,10 @@
                     <pic:cNvPicPr/>
                   </pic:nvPicPr>
                   <pic:blipFill>
-                    <a:blip r:embed="rId5">
+                    <a:blip r:embed="rId6">
                       <a:extLst>
                         <a:ext uri="{96DAC541-7B7A-43D3-8B79-37D633B846F1}">
-                          <asvg:svgBlip xmlns:asvg="http://schemas.microsoft.com/office/drawing/2016/SVG/main" r:embed="rId6"/>
+                          <asvg:svgBlip xmlns:asvg="http://schemas.microsoft.com/office/drawing/2016/SVG/main" r:embed="rId7"/>
                         </a:ext>
                       </a:extLst>
                     </a:blip>
@@ -1677,6 +2698,7 @@
       </w:r>
       <w:r>
         <w:rPr>
+          <w:noProof/>
           <w:lang w:val="ru-RU"/>
         </w:rPr>
         <w:drawing>
@@ -1695,10 +2717,10 @@
                     <pic:cNvPicPr/>
                   </pic:nvPicPr>
                   <pic:blipFill>
-                    <a:blip r:embed="rId5">
+                    <a:blip r:embed="rId6">
                       <a:extLst>
                         <a:ext uri="{96DAC541-7B7A-43D3-8B79-37D633B846F1}">
-                          <asvg:svgBlip xmlns:asvg="http://schemas.microsoft.com/office/drawing/2016/SVG/main" r:embed="rId6"/>
+                          <asvg:svgBlip xmlns:asvg="http://schemas.microsoft.com/office/drawing/2016/SVG/main" r:embed="rId7"/>
                         </a:ext>
                       </a:extLst>
                     </a:blip>
@@ -1723,6 +2745,7 @@
       </w:r>
       <w:r>
         <w:rPr>
+          <w:noProof/>
           <w:lang w:val="ru-RU"/>
         </w:rPr>
         <w:drawing>
@@ -1741,10 +2764,10 @@
                     <pic:cNvPicPr/>
                   </pic:nvPicPr>
                   <pic:blipFill>
-                    <a:blip r:embed="rId5">
+                    <a:blip r:embed="rId6">
                       <a:extLst>
                         <a:ext uri="{96DAC541-7B7A-43D3-8B79-37D633B846F1}">
-                          <asvg:svgBlip xmlns:asvg="http://schemas.microsoft.com/office/drawing/2016/SVG/main" r:embed="rId6"/>
+                          <asvg:svgBlip xmlns:asvg="http://schemas.microsoft.com/office/drawing/2016/SVG/main" r:embed="rId7"/>
                         </a:ext>
                       </a:extLst>
                     </a:blip>
@@ -1769,6 +2792,7 @@
       </w:r>
       <w:r>
         <w:rPr>
+          <w:noProof/>
           <w:lang w:val="ru-RU"/>
         </w:rPr>
         <w:drawing>
@@ -1787,10 +2811,10 @@
                     <pic:cNvPicPr/>
                   </pic:nvPicPr>
                   <pic:blipFill>
-                    <a:blip r:embed="rId5">
+                    <a:blip r:embed="rId6">
                       <a:extLst>
                         <a:ext uri="{96DAC541-7B7A-43D3-8B79-37D633B846F1}">
-                          <asvg:svgBlip xmlns:asvg="http://schemas.microsoft.com/office/drawing/2016/SVG/main" r:embed="rId6"/>
+                          <asvg:svgBlip xmlns:asvg="http://schemas.microsoft.com/office/drawing/2016/SVG/main" r:embed="rId7"/>
                         </a:ext>
                       </a:extLst>
                     </a:blip>
@@ -1815,6 +2839,7 @@
       </w:r>
       <w:r>
         <w:rPr>
+          <w:noProof/>
           <w:lang w:val="ru-RU"/>
         </w:rPr>
         <w:drawing>
@@ -1833,10 +2858,10 @@
                     <pic:cNvPicPr/>
                   </pic:nvPicPr>
                   <pic:blipFill>
-                    <a:blip r:embed="rId5">
+                    <a:blip r:embed="rId6">
                       <a:extLst>
                         <a:ext uri="{96DAC541-7B7A-43D3-8B79-37D633B846F1}">
-                          <asvg:svgBlip xmlns:asvg="http://schemas.microsoft.com/office/drawing/2016/SVG/main" r:embed="rId6"/>
+                          <asvg:svgBlip xmlns:asvg="http://schemas.microsoft.com/office/drawing/2016/SVG/main" r:embed="rId7"/>
                         </a:ext>
                       </a:extLst>
                     </a:blip>
@@ -1861,6 +2886,7 @@
       </w:r>
       <w:r>
         <w:rPr>
+          <w:noProof/>
           <w:lang w:val="ru-RU"/>
         </w:rPr>
         <w:drawing>
@@ -1879,10 +2905,10 @@
                     <pic:cNvPicPr/>
                   </pic:nvPicPr>
                   <pic:blipFill>
-                    <a:blip r:embed="rId5">
+                    <a:blip r:embed="rId6">
                       <a:extLst>
                         <a:ext uri="{96DAC541-7B7A-43D3-8B79-37D633B846F1}">
-                          <asvg:svgBlip xmlns:asvg="http://schemas.microsoft.com/office/drawing/2016/SVG/main" r:embed="rId6"/>
+                          <asvg:svgBlip xmlns:asvg="http://schemas.microsoft.com/office/drawing/2016/SVG/main" r:embed="rId7"/>
                         </a:ext>
                       </a:extLst>
                     </a:blip>
@@ -1907,6 +2933,7 @@
       </w:r>
       <w:r>
         <w:rPr>
+          <w:noProof/>
           <w:lang w:val="ru-RU"/>
         </w:rPr>
         <w:drawing>
@@ -1925,10 +2952,10 @@
                     <pic:cNvPicPr/>
                   </pic:nvPicPr>
                   <pic:blipFill>
-                    <a:blip r:embed="rId5">
+                    <a:blip r:embed="rId6">
                       <a:extLst>
                         <a:ext uri="{96DAC541-7B7A-43D3-8B79-37D633B846F1}">
-                          <asvg:svgBlip xmlns:asvg="http://schemas.microsoft.com/office/drawing/2016/SVG/main" r:embed="rId6"/>
+                          <asvg:svgBlip xmlns:asvg="http://schemas.microsoft.com/office/drawing/2016/SVG/main" r:embed="rId7"/>
                         </a:ext>
                       </a:extLst>
                     </a:blip>
@@ -1953,6 +2980,7 @@
       </w:r>
       <w:r>
         <w:rPr>
+          <w:noProof/>
           <w:lang w:val="ru-RU"/>
         </w:rPr>
         <w:drawing>
@@ -1971,10 +2999,10 @@
                     <pic:cNvPicPr/>
                   </pic:nvPicPr>
                   <pic:blipFill>
-                    <a:blip r:embed="rId5">
+                    <a:blip r:embed="rId6">
                       <a:extLst>
                         <a:ext uri="{96DAC541-7B7A-43D3-8B79-37D633B846F1}">
-                          <asvg:svgBlip xmlns:asvg="http://schemas.microsoft.com/office/drawing/2016/SVG/main" r:embed="rId6"/>
+                          <asvg:svgBlip xmlns:asvg="http://schemas.microsoft.com/office/drawing/2016/SVG/main" r:embed="rId7"/>
                         </a:ext>
                       </a:extLst>
                     </a:blip>
@@ -1999,6 +3027,7 @@
       </w:r>
       <w:r>
         <w:rPr>
+          <w:noProof/>
           <w:lang w:val="ru-RU"/>
         </w:rPr>
         <w:drawing>
@@ -2017,10 +3046,10 @@
                     <pic:cNvPicPr/>
                   </pic:nvPicPr>
                   <pic:blipFill>
-                    <a:blip r:embed="rId5">
+                    <a:blip r:embed="rId6">
                       <a:extLst>
                         <a:ext uri="{96DAC541-7B7A-43D3-8B79-37D633B846F1}">
-                          <asvg:svgBlip xmlns:asvg="http://schemas.microsoft.com/office/drawing/2016/SVG/main" r:embed="rId6"/>
+                          <asvg:svgBlip xmlns:asvg="http://schemas.microsoft.com/office/drawing/2016/SVG/main" r:embed="rId7"/>
                         </a:ext>
                       </a:extLst>
                     </a:blip>
@@ -2045,6 +3074,7 @@
       </w:r>
       <w:r>
         <w:rPr>
+          <w:noProof/>
           <w:lang w:val="ru-RU"/>
         </w:rPr>
         <w:drawing>
@@ -2063,10 +3093,10 @@
                     <pic:cNvPicPr/>
                   </pic:nvPicPr>
                   <pic:blipFill>
-                    <a:blip r:embed="rId5">
+                    <a:blip r:embed="rId6">
                       <a:extLst>
                         <a:ext uri="{96DAC541-7B7A-43D3-8B79-37D633B846F1}">
-                          <asvg:svgBlip xmlns:asvg="http://schemas.microsoft.com/office/drawing/2016/SVG/main" r:embed="rId6"/>
+                          <asvg:svgBlip xmlns:asvg="http://schemas.microsoft.com/office/drawing/2016/SVG/main" r:embed="rId7"/>
                         </a:ext>
                       </a:extLst>
                     </a:blip>
@@ -2091,6 +3121,7 @@
       </w:r>
       <w:r>
         <w:rPr>
+          <w:noProof/>
           <w:lang w:val="ru-RU"/>
         </w:rPr>
         <w:drawing>
@@ -2109,10 +3140,10 @@
                     <pic:cNvPicPr/>
                   </pic:nvPicPr>
                   <pic:blipFill>
-                    <a:blip r:embed="rId5">
+                    <a:blip r:embed="rId6">
                       <a:extLst>
                         <a:ext uri="{96DAC541-7B7A-43D3-8B79-37D633B846F1}">
-                          <asvg:svgBlip xmlns:asvg="http://schemas.microsoft.com/office/drawing/2016/SVG/main" r:embed="rId6"/>
+                          <asvg:svgBlip xmlns:asvg="http://schemas.microsoft.com/office/drawing/2016/SVG/main" r:embed="rId7"/>
                         </a:ext>
                       </a:extLst>
                     </a:blip>
@@ -2137,6 +3168,7 @@
       </w:r>
       <w:r>
         <w:rPr>
+          <w:noProof/>
           <w:lang w:val="ru-RU"/>
         </w:rPr>
         <w:drawing>
@@ -2155,10 +3187,10 @@
                     <pic:cNvPicPr/>
                   </pic:nvPicPr>
                   <pic:blipFill>
-                    <a:blip r:embed="rId5">
+                    <a:blip r:embed="rId6">
                       <a:extLst>
                         <a:ext uri="{96DAC541-7B7A-43D3-8B79-37D633B846F1}">
-                          <asvg:svgBlip xmlns:asvg="http://schemas.microsoft.com/office/drawing/2016/SVG/main" r:embed="rId6"/>
+                          <asvg:svgBlip xmlns:asvg="http://schemas.microsoft.com/office/drawing/2016/SVG/main" r:embed="rId7"/>
                         </a:ext>
                       </a:extLst>
                     </a:blip>
@@ -2183,6 +3215,7 @@
       </w:r>
       <w:r>
         <w:rPr>
+          <w:noProof/>
           <w:lang w:val="ru-RU"/>
         </w:rPr>
         <w:drawing>
@@ -2201,10 +3234,10 @@
                     <pic:cNvPicPr/>
                   </pic:nvPicPr>
                   <pic:blipFill>
-                    <a:blip r:embed="rId5">
+                    <a:blip r:embed="rId6">
                       <a:extLst>
                         <a:ext uri="{96DAC541-7B7A-43D3-8B79-37D633B846F1}">
-                          <asvg:svgBlip xmlns:asvg="http://schemas.microsoft.com/office/drawing/2016/SVG/main" r:embed="rId6"/>
+                          <asvg:svgBlip xmlns:asvg="http://schemas.microsoft.com/office/drawing/2016/SVG/main" r:embed="rId7"/>
                         </a:ext>
                       </a:extLst>
                     </a:blip>
@@ -2229,6 +3262,7 @@
       </w:r>
       <w:r>
         <w:rPr>
+          <w:noProof/>
           <w:lang w:val="ru-RU"/>
         </w:rPr>
         <w:drawing>
@@ -2247,10 +3281,10 @@
                     <pic:cNvPicPr/>
                   </pic:nvPicPr>
                   <pic:blipFill>
-                    <a:blip r:embed="rId5">
+                    <a:blip r:embed="rId6">
                       <a:extLst>
                         <a:ext uri="{96DAC541-7B7A-43D3-8B79-37D633B846F1}">
-                          <asvg:svgBlip xmlns:asvg="http://schemas.microsoft.com/office/drawing/2016/SVG/main" r:embed="rId6"/>
+                          <asvg:svgBlip xmlns:asvg="http://schemas.microsoft.com/office/drawing/2016/SVG/main" r:embed="rId7"/>
                         </a:ext>
                       </a:extLst>
                     </a:blip>
@@ -2275,6 +3309,7 @@
       </w:r>
       <w:r>
         <w:rPr>
+          <w:noProof/>
           <w:lang w:val="ru-RU"/>
         </w:rPr>
         <w:drawing>
@@ -2293,10 +3328,10 @@
                     <pic:cNvPicPr/>
                   </pic:nvPicPr>
                   <pic:blipFill>
-                    <a:blip r:embed="rId5">
+                    <a:blip r:embed="rId6">
                       <a:extLst>
                         <a:ext uri="{96DAC541-7B7A-43D3-8B79-37D633B846F1}">
-                          <asvg:svgBlip xmlns:asvg="http://schemas.microsoft.com/office/drawing/2016/SVG/main" r:embed="rId6"/>
+                          <asvg:svgBlip xmlns:asvg="http://schemas.microsoft.com/office/drawing/2016/SVG/main" r:embed="rId7"/>
                         </a:ext>
                       </a:extLst>
                     </a:blip>
@@ -2321,6 +3356,7 @@
       </w:r>
       <w:r>
         <w:rPr>
+          <w:noProof/>
           <w:lang w:val="ru-RU"/>
         </w:rPr>
         <w:drawing>
@@ -2339,10 +3375,10 @@
                     <pic:cNvPicPr/>
                   </pic:nvPicPr>
                   <pic:blipFill>
-                    <a:blip r:embed="rId5">
+                    <a:blip r:embed="rId6">
                       <a:extLst>
                         <a:ext uri="{96DAC541-7B7A-43D3-8B79-37D633B846F1}">
-                          <asvg:svgBlip xmlns:asvg="http://schemas.microsoft.com/office/drawing/2016/SVG/main" r:embed="rId6"/>
+                          <asvg:svgBlip xmlns:asvg="http://schemas.microsoft.com/office/drawing/2016/SVG/main" r:embed="rId7"/>
                         </a:ext>
                       </a:extLst>
                     </a:blip>
@@ -2367,6 +3403,7 @@
       </w:r>
       <w:r>
         <w:rPr>
+          <w:noProof/>
           <w:lang w:val="ru-RU"/>
         </w:rPr>
         <w:drawing>
@@ -2385,10 +3422,10 @@
                     <pic:cNvPicPr/>
                   </pic:nvPicPr>
                   <pic:blipFill>
-                    <a:blip r:embed="rId5">
+                    <a:blip r:embed="rId6">
                       <a:extLst>
                         <a:ext uri="{96DAC541-7B7A-43D3-8B79-37D633B846F1}">
-                          <asvg:svgBlip xmlns:asvg="http://schemas.microsoft.com/office/drawing/2016/SVG/main" r:embed="rId6"/>
+                          <asvg:svgBlip xmlns:asvg="http://schemas.microsoft.com/office/drawing/2016/SVG/main" r:embed="rId7"/>
                         </a:ext>
                       </a:extLst>
                     </a:blip>

</xml_diff>